<commit_message>
Actualizado manual con anexo de marzo
</commit_message>
<xml_diff>
--- a/Maual_Sistemas_AntonioG.docx
+++ b/Maual_Sistemas_AntonioG.docx
@@ -2172,7 +2172,75 @@
         <w:t> del servidor que hiciste en el ejercicio 9.</w:t>
       </w:r>
     </w:p>
-    <w:p/>
+    <w:p>
+      <w:pPr>
+        <w:spacing w:after="100" w:afterAutospacing="1" w:line="240" w:lineRule="auto"/>
+        <w:rPr>
+          <w:rFonts w:ascii="Poppins" w:eastAsia="Times New Roman" w:hAnsi="Poppins" w:cs="Poppins"/>
+          <w:color w:val="1D2125"/>
+          <w:sz w:val="23"/>
+          <w:szCs w:val="23"/>
+          <w:lang w:eastAsia="es-ES"/>
+        </w:rPr>
+      </w:pPr>
+    </w:p>
+    <w:p>
+      <w:pPr>
+        <w:spacing w:after="100" w:afterAutospacing="1" w:line="240" w:lineRule="auto"/>
+        <w:rPr>
+          <w:rFonts w:ascii="Poppins" w:eastAsia="Times New Roman" w:hAnsi="Poppins" w:cs="Poppins"/>
+          <w:color w:val="1D2125"/>
+          <w:sz w:val="23"/>
+          <w:szCs w:val="23"/>
+          <w:lang w:eastAsia="es-ES"/>
+        </w:rPr>
+      </w:pPr>
+    </w:p>
+    <w:p>
+      <w:pPr>
+        <w:spacing w:after="100" w:afterAutospacing="1" w:line="240" w:lineRule="auto"/>
+        <w:rPr>
+          <w:rFonts w:ascii="Poppins" w:eastAsia="Times New Roman" w:hAnsi="Poppins" w:cs="Poppins"/>
+          <w:color w:val="1D2125"/>
+          <w:sz w:val="23"/>
+          <w:szCs w:val="23"/>
+          <w:lang w:eastAsia="es-ES"/>
+        </w:rPr>
+      </w:pPr>
+    </w:p>
+    <w:p>
+      <w:pPr>
+        <w:spacing w:after="100" w:afterAutospacing="1" w:line="240" w:lineRule="auto"/>
+        <w:rPr>
+          <w:rFonts w:ascii="Poppins" w:eastAsia="Times New Roman" w:hAnsi="Poppins" w:cs="Poppins"/>
+          <w:color w:val="1D2125"/>
+          <w:sz w:val="23"/>
+          <w:szCs w:val="23"/>
+          <w:lang w:eastAsia="es-ES"/>
+        </w:rPr>
+      </w:pPr>
+    </w:p>
+    <w:p>
+      <w:pPr>
+        <w:spacing w:after="100" w:afterAutospacing="1" w:line="240" w:lineRule="auto"/>
+        <w:rPr>
+          <w:rFonts w:ascii="Poppins" w:eastAsia="Times New Roman" w:hAnsi="Poppins" w:cs="Poppins"/>
+          <w:color w:val="1D2125"/>
+          <w:sz w:val="23"/>
+          <w:szCs w:val="23"/>
+          <w:lang w:eastAsia="es-ES"/>
+        </w:rPr>
+      </w:pPr>
+    </w:p>
+    <w:p>
+      <w:pPr>
+        <w:pStyle w:val="Ttulo"/>
+      </w:pPr>
+      <w:r>
+        <w:lastRenderedPageBreak/>
+        <w:t>Anexo: Actualización Marzo</w:t>
+      </w:r>
+    </w:p>
     <w:sectPr>
       <w:pgSz w:w="11906" w:h="16838"/>
       <w:pgMar w:top="1417" w:right="1701" w:bottom="1417" w:left="1701" w:header="708" w:footer="708" w:gutter="0"/>
@@ -2897,6 +2965,40 @@
       <w:contextualSpacing/>
     </w:pPr>
   </w:style>
+  <w:style w:type="paragraph" w:styleId="Ttulo">
+    <w:name w:val="Title"/>
+    <w:basedOn w:val="Normal"/>
+    <w:next w:val="Normal"/>
+    <w:link w:val="TtuloCar"/>
+    <w:uiPriority w:val="10"/>
+    <w:qFormat/>
+    <w:rsid w:val="00322463"/>
+    <w:pPr>
+      <w:spacing w:after="0" w:line="240" w:lineRule="auto"/>
+      <w:contextualSpacing/>
+    </w:pPr>
+    <w:rPr>
+      <w:rFonts w:asciiTheme="majorHAnsi" w:eastAsiaTheme="majorEastAsia" w:hAnsiTheme="majorHAnsi" w:cstheme="majorBidi"/>
+      <w:spacing w:val="-10"/>
+      <w:kern w:val="28"/>
+      <w:sz w:val="56"/>
+      <w:szCs w:val="56"/>
+    </w:rPr>
+  </w:style>
+  <w:style w:type="character" w:customStyle="1" w:styleId="TtuloCar">
+    <w:name w:val="Título Car"/>
+    <w:basedOn w:val="Fuentedeprrafopredeter"/>
+    <w:link w:val="Ttulo"/>
+    <w:uiPriority w:val="10"/>
+    <w:rsid w:val="00322463"/>
+    <w:rPr>
+      <w:rFonts w:asciiTheme="majorHAnsi" w:eastAsiaTheme="majorEastAsia" w:hAnsiTheme="majorHAnsi" w:cstheme="majorBidi"/>
+      <w:spacing w:val="-10"/>
+      <w:kern w:val="28"/>
+      <w:sz w:val="56"/>
+      <w:szCs w:val="56"/>
+    </w:rPr>
+  </w:style>
 </w:styles>
 </file>
 

</xml_diff>